<commit_message>
Increase font sizes for comfortable glasses-free reading (body 11->14pt)
</commit_message>
<xml_diff>
--- a/tools/reference.docx
+++ b/tools/reference.docx
@@ -508,7 +508,7 @@
     <w:rPr>
       <w:rFonts w:ascii="Roboto" w:hAnsi="Roboto" w:eastAsia="Roboto" w:cs="Roboto"/>
       <w:color w:val="1A1A1A"/>
-      <w:sz w:val="22"/>
+      <w:sz w:val="28"/>
     </w:rPr>
   </w:style>
   <w:style w:type="paragraph" w:styleId="BodyText">
@@ -522,7 +522,7 @@
     <w:rPr>
       <w:rFonts w:ascii="Roboto" w:hAnsi="Roboto" w:eastAsia="Roboto" w:cs="Roboto"/>
       <w:color w:val="1A1A1A"/>
-      <w:sz w:val="22"/>
+      <w:sz w:val="28"/>
     </w:rPr>
   </w:style>
   <w:style w:type="paragraph" w:customStyle="1" w:styleId="FirstParagraph">
@@ -536,7 +536,7 @@
     <w:rPr>
       <w:rFonts w:ascii="Roboto" w:hAnsi="Roboto" w:eastAsia="Roboto" w:cs="Roboto"/>
       <w:color w:val="1A1A1A"/>
-      <w:sz w:val="22"/>
+      <w:sz w:val="28"/>
     </w:rPr>
   </w:style>
   <w:style w:type="paragraph" w:customStyle="1" w:styleId="Compact">
@@ -549,7 +549,7 @@
     <w:rPr>
       <w:rFonts w:ascii="Roboto" w:hAnsi="Roboto" w:eastAsia="Roboto" w:cs="Roboto"/>
       <w:color w:val="1A1A1A"/>
-      <w:sz w:val="22"/>
+      <w:sz w:val="28"/>
     </w:rPr>
   </w:style>
   <w:style w:type="paragraph" w:styleId="Title">
@@ -569,7 +569,7 @@
       <w:rFonts w:asciiTheme="majorHAnsi" w:eastAsiaTheme="majorEastAsia" w:hAnsiTheme="majorHAnsi" w:cstheme="majorBidi" w:ascii="Roboto" w:hAnsi="Roboto" w:eastAsia="Roboto" w:cs="Roboto"/>
       <w:b/>
       <w:color w:val="1F3A5F"/>
-      <w:sz w:val="64"/>
+      <w:sz w:val="72"/>
       <w:szCs w:val="56"/>
     </w:rPr>
   </w:style>
@@ -604,7 +604,7 @@
       <w:i w:val="0"/>
       <w:color w:val="555555"/>
       <w:spacing w:val="15"/>
-      <w:sz w:val="32"/>
+      <w:sz w:val="40"/>
       <w:szCs w:val="28"/>
     </w:rPr>
   </w:style>
@@ -711,7 +711,7 @@
       <w:rFonts w:asciiTheme="majorHAnsi" w:eastAsiaTheme="majorEastAsia" w:hAnsiTheme="majorHAnsi" w:cstheme="majorBidi" w:ascii="Roboto" w:hAnsi="Roboto" w:eastAsia="Roboto" w:cs="Roboto"/>
       <w:b/>
       <w:color w:val="1F3A5F"/>
-      <w:sz w:val="48"/>
+      <w:sz w:val="56"/>
       <w:szCs w:val="40"/>
     </w:rPr>
   </w:style>
@@ -735,7 +735,7 @@
       <w:rFonts w:asciiTheme="majorHAnsi" w:eastAsiaTheme="majorEastAsia" w:hAnsiTheme="majorHAnsi" w:cstheme="majorBidi" w:ascii="Roboto" w:hAnsi="Roboto" w:eastAsia="Roboto" w:cs="Roboto"/>
       <w:b/>
       <w:color w:val="2E5A88"/>
-      <w:sz w:val="36"/>
+      <w:sz w:val="44"/>
       <w:szCs w:val="32"/>
     </w:rPr>
   </w:style>
@@ -759,7 +759,7 @@
       <w:rFonts w:eastAsiaTheme="majorEastAsia" w:cstheme="majorBidi" w:ascii="Roboto" w:hAnsi="Roboto" w:eastAsia="Roboto" w:cs="Roboto"/>
       <w:b/>
       <w:color w:val="3D7AB8"/>
-      <w:sz w:val="28"/>
+      <w:sz w:val="36"/>
       <w:szCs w:val="28"/>
     </w:rPr>
   </w:style>
@@ -785,7 +785,7 @@
       <w:i/>
       <w:iCs/>
       <w:color w:val="5A5A5A"/>
-      <w:sz w:val="24"/>
+      <w:sz w:val="32"/>
     </w:rPr>
   </w:style>
   <w:style w:type="paragraph" w:styleId="Heading5">
@@ -809,7 +809,7 @@
       <w:b/>
       <w:i/>
       <w:color w:val="5A5A5A"/>
-      <w:sz w:val="22"/>
+      <w:sz w:val="28"/>
     </w:rPr>
   </w:style>
   <w:style w:type="paragraph" w:styleId="Heading6">
@@ -833,7 +833,7 @@
       <w:i/>
       <w:iCs/>
       <w:color w:val="5A5A5A"/>
-      <w:sz w:val="22"/>
+      <w:sz w:val="28"/>
     </w:rPr>
   </w:style>
   <w:style w:type="paragraph" w:styleId="Heading7">
@@ -1144,7 +1144,7 @@
     <w:rPr>
       <w:rFonts w:ascii="Roboto Mono" w:hAnsi="Roboto Mono" w:eastAsia="Roboto Mono" w:cs="Roboto Mono"/>
       <w:color w:val="1F3A5F"/>
-      <w:sz w:val="20"/>
+      <w:sz w:val="26"/>
     </w:rPr>
   </w:style>
   <w:style w:type="character" w:customStyle="1" w:styleId="SectionNumber">
@@ -1193,7 +1193,7 @@
     <w:rPr>
       <w:rFonts w:ascii="Roboto Mono" w:hAnsi="Roboto Mono" w:eastAsia="Roboto Mono" w:cs="Roboto Mono"/>
       <w:color w:val="1A1A1A"/>
-      <w:sz w:val="18"/>
+      <w:sz w:val="24"/>
     </w:rPr>
   </w:style>
 </w:styles>

</xml_diff>